<commit_message>
Knowledge - 2-Science - 1/31/2026 - part 1
</commit_message>
<xml_diff>
--- a/Knowledge/2-Science/1-Formal sciences/0-Intro to Formal sciences/3-Wiki source/1-Outline of formal science/Sources - Outline of formal science - Wiki source.docx
+++ b/Knowledge/2-Science/1-Formal sciences/0-Intro to Formal sciences/3-Wiki source/1-Outline of formal science/Sources - Outline of formal science - Wiki source.docx
@@ -89,6 +89,30 @@
       </w:r>
       <w:r>
         <w:rPr>
+          <w:b/>
+          <w:sz w:val="18"/>
+          <w:szCs w:val="18"/>
+        </w:rPr>
+        <w:t>[</w:t>
+      </w:r>
+      <w:r>
+        <w:rPr>
+          <w:bCs/>
+          <w:sz w:val="18"/>
+          <w:szCs w:val="18"/>
+        </w:rPr>
+        <w:t>Outline of formal science.pdf</w:t>
+      </w:r>
+      <w:r>
+        <w:rPr>
+          <w:b/>
+          <w:sz w:val="18"/>
+          <w:szCs w:val="18"/>
+        </w:rPr>
+        <w:t xml:space="preserve">] </w:t>
+      </w:r>
+      <w:r>
+        <w:rPr>
           <w:bCs/>
           <w:sz w:val="18"/>
           <w:szCs w:val="18"/>
@@ -621,8 +645,18 @@
           <w:sz w:val="18"/>
           <w:szCs w:val="18"/>
         </w:rPr>
-        <w:t>StorageType: Cloud -&gt; Platform: GitHub -&gt; Account: topicsscience -&gt; Repository: kingdomheartsknowledge -&gt; Path: Knowledge/2-Science/1-Formal sciences/0-Intro to Formal sciences/..</w:t>
-      </w:r>
+        <w:t>StorageType: Cloud -&gt; Platform: GitHub -&gt; Account: topicsscience -&gt; Repository: kingdomheartsknowledge -&gt; Path: Knowledge/2-Science/1-Formal sciences/0-Intro to Formal sciences</w:t>
+      </w:r>
+      <w:proofErr w:type="gramStart"/>
+      <w:r>
+        <w:rPr>
+          <w:bCs/>
+          <w:sz w:val="18"/>
+          <w:szCs w:val="18"/>
+        </w:rPr>
+        <w:t>/..</w:t>
+      </w:r>
+      <w:proofErr w:type="gramEnd"/>
     </w:p>
     <w:p>
       <w:pPr>

</xml_diff>